<commit_message>
Add comprehensive Presentation and Evaluation Guide PDF and Report PDF
</commit_message>
<xml_diff>
--- a/Project_Implementation_Report.docx
+++ b/Project_Implementation_Report.docx
@@ -164,26 +164,17 @@
     </w:p>
     <w:p>
       <w:r>
-        <w:t>Accurate forecasting of equity prices represents a cornerstone challenge in quantitative financial analytics, arising from the non-stationarity, stochastic volatility, and complex temporal dependencies governing market time-series. This project report presents the complete architecture, implementation, and empirical evaluation of an enterprise-grade machine learning pipeline for equity price forecasting using Apple Inc. (AAPL) daily trading records spanning January 2015 to January 2024. The forecasting fram</w:t>
-      </w:r>
-      <w:r>
-        <w:t>ework benchmarks four model families under identical chronological splits: an L2-regularized Ridge Regression baseline, a three-layer Bidirectional Long Short-Term Memory (BiLSTM) network with Bahdanau attention pooling, a Temporal Fusion Transformer-lite (TFT-lite) using multi-head self-attention with a CLS token, and a Stacking Ensemble aggregating sub-model representations via a Ridge meta-learner.</w:t>
+        <w:t>Accurate forecasting of equity prices represents a cornerstone challenge in quantitative financial analytics, arising from the non-stationarity, stochastic volatility, and complex temporal dependencies governing market time-series. This project report presents the complete architecture, implementation, and empirical evaluation of an enterprise-grade machine learning pipeline for equity price forecasting using Apple Inc. (AAPL) daily trading records spanning January 2015 to January 2024. The forecasting framework benchmarks four model families under identical chronological splits: an L2-regularized Ridge Regression baseline, a three-layer Bidirectional Long Short-Term Memory (BiLSTM) network with Bahdanau attention pooling, a Temporal Fusion Transformer-lite (TFT-lite) using multi-head self-attention with a CLS token, and a Stacking Ensemble aggregating sub-model representations via a Ridge meta-learner.</w:t>
       </w:r>
     </w:p>
     <w:p>
       <w:r>
-        <w:t xml:space="preserve">A foundational architectural innovation introduced across all deep networks is Residual Price Anchoring — formulating the neural learning target on stationary day-to-day price innovations (ŷ_t = y_{t-1} + Δŷ_t) rather than absolute unconstrained price levels. This eliminates non-stationary drift, stabilizes backpropagation gradients, and anchors predictions to current market conditions. The feature engineering library computes 51 multi-frequency technical indicators across 11 financial categories, spanning </w:t>
-      </w:r>
-      <w:r>
-        <w:t>momentum oscillators, trend divergence, volatility bands, volume dynamics, and calendar cyclicity. Models are optimized using Huber Loss with Cosine Annealing learning rate schedules and early stopping (patience = 12 epochs).</w:t>
+        <w:t>A foundational architectural innovation introduced across all deep networks is Residual Price Anchoring — formulating the neural learning target on stationary day-to-day price innovations (ŷ_t = y_{t-1} + Δŷ_t) rather than absolute unconstrained price levels. This eliminates non-stationary drift, stabilizes backpropagation gradients, and anchors predictions to current market conditions. The feature engineering library computes 51 multi-frequency technical indicators across 11 financial categories, spanning momentum oscillators, trend divergence, volatility bands, volume dynamics, and calendar cyclicity. Models are optimized using Huber Loss with Cosine Annealing learning rate schedules and early stopping (patience = 12 epochs).</w:t>
       </w:r>
     </w:p>
     <w:p>
       <w:r>
-        <w:t>Empirical evaluation on 400 chronologically held-out test trading days demonstrates that the BiLSTM+Attention network achieves superior regression accuracy with an RMSE of $3.7145, MAE of $2.8618, MAPE of 1.84%, and R² score of 0.9623. The TFT-lite Transformer delivers competitive parity with an R² of 0.9622 and RMSE of $3.7195. Ten publication-grade diagnostic charts are generated, covering loss convergence, trajectory alignment, residual distributions, correlation structures, attention heatmaps, permutati</w:t>
-      </w:r>
-      <w:r>
-        <w:t>on feature rankings, and an algorithmic trading simulation. The entire pipeline is open-sourced for complete reproducibility.</w:t>
+        <w:t>Empirical evaluation on 400 chronologically held-out test trading days demonstrates that the BiLSTM+Attention network achieves superior regression accuracy with an RMSE of $3.7145, MAE of $2.8618, MAPE of 1.84%, and R² score of 0.9623. The TFT-lite Transformer delivers competitive parity with an R² of 0.9622 and RMSE of $3.7195. Ten publication-grade diagnostic charts are generated, covering loss convergence, trajectory alignment, residual distributions, correlation structures, attention heatmaps, permutation feature rankings, and an algorithmic trading simulation. The entire pipeline is open-sourced for complete reproducibility.</w:t>
       </w:r>
     </w:p>
     <w:p>
@@ -2616,18 +2607,12 @@
     </w:p>
     <w:p>
       <w:r>
-        <w:t>The global equity market constitutes the primary mechanism for international capital allocation, facilitating the daily exchange of trillions of dollars in liquidity across corporate enterprises and sovereign jurisdictions. In India, active retail participation on the National Stock Exchange (NSE) has expanded rapidly, surpassing 120 million registered demat accounts [1]. Concurrently, mature exchanges such as NASDAQ and the NYSE transact billions of shares daily under high-frequency algorithmic regimes. In</w:t>
-      </w:r>
-      <w:r>
-        <w:t xml:space="preserve"> this environment, accurate forecasting of price movements and regime transitions confers critical strategic advantage to institutional asset managers, quantitative traders, and risk analysts.</w:t>
+        <w:t>The global equity market constitutes the primary mechanism for international capital allocation, facilitating the daily exchange of trillions of dollars in liquidity across corporate enterprises and sovereign jurisdictions. In India, active retail participation on the National Stock Exchange (NSE) has expanded rapidly, surpassing 120 million registered demat accounts [1]. Concurrently, mature exchanges such as NASDAQ and the NYSE transact billions of shares daily under high-frequency algorithmic regimes. In this environment, accurate forecasting of price movements and regime transitions confers critical strategic advantage to institutional asset managers, quantitative traders, and risk analysts.</w:t>
       </w:r>
     </w:p>
     <w:p>
       <w:r>
-        <w:t>Historically, equity prediction has been divided between fundamental analysis, evaluating intrinsic business health, and technical analysis, identifying statistical patterns in price/volume histories. The Efficient Market Hypothesis (EMH) asserts that all public information is instantly reflected in prices, implying a random walk [9], [13]. However, empirical data demonstrates persistent non-linearities, momentum clusters, and multi-frequency dependencies that non-parametric Machine Learning (ML) and Deep L</w:t>
-      </w:r>
-      <w:r>
-        <w:t>earning (DL) architectures are uniquely positioned to capture.</w:t>
+        <w:t>Historically, equity prediction has been divided between fundamental analysis, evaluating intrinsic business health, and technical analysis, identifying statistical patterns in price/volume histories. The Efficient Market Hypothesis (EMH) asserts that all public information is instantly reflected in prices, implying a random walk [9], [13]. However, empirical data demonstrates persistent non-linearities, momentum clusters, and multi-frequency dependencies that non-parametric Machine Learning (ML) and Deep Learning (DL) architectures are uniquely positioned to capture.</w:t>
       </w:r>
     </w:p>
     <w:p>
@@ -2643,10 +2628,7 @@
     </w:p>
     <w:p>
       <w:r>
-        <w:t>This project implements a complete, production-ready machine learning framework for equity forecasting using Apple Inc. (AAPL) trading data spanning 2015 to 2024. It explicitly resolves four prevalent practical challenges: non-stationary price drift, high-dimensional indicator multicollinearity, lookback window sensitivity, and the disconnect between regression error and trading profitability. The system implements Residual Price Anchoring, engineers 51 multi-frequency technical features, benchmarks four di</w:t>
-      </w:r>
-      <w:r>
-        <w:t>stinct model families (Ridge baseline, BiLSTM+Attention, TFT-lite Transformer, and Stacking Ensemble), extracts attention explainability weights, and backtests a long/short algorithmic trading strategy.</w:t>
+        <w:t>This project implements a complete, production-ready machine learning framework for equity forecasting using Apple Inc. (AAPL) trading data spanning 2015 to 2024. It explicitly resolves four prevalent practical challenges: non-stationary price drift, high-dimensional indicator multicollinearity, lookback window sensitivity, and the disconnect between regression error and trading profitability. The system implements Residual Price Anchoring, engineers 51 multi-frequency technical features, benchmarks four distinct model families (Ridge baseline, BiLSTM+Attention, TFT-lite Transformer, and Stacking Ensemble), extracts attention explainability weights, and backtests a long/short algorithmic trading strategy.</w:t>
       </w:r>
     </w:p>
     <w:p>
@@ -2699,10 +2681,7 @@
     </w:p>
     <w:p>
       <w:r>
-        <w:t>Rather [2] introduced an LSTM-based Deep Neural Network (LSTM-DNN) combined with an Autoregressive Moving Pointer Model (AMPM) for NIFTY-50 stocks, establishing that autoregressive residual formulation stabilizes neural training and downstream Markowitz portfolio optimization. Hansun and Young [3] evaluated three-layer LSTM networks on emerging market banking equities from Indonesia's LQ45 index, demonstrating that compact recurrent configurations achieve robust predictive accuracy without overfitting noise</w:t>
-      </w:r>
-      <w:r>
-        <w:t>.</w:t>
+        <w:t>Rather [2] introduced an LSTM-based Deep Neural Network (LSTM-DNN) combined with an Autoregressive Moving Pointer Model (AMPM) for NIFTY-50 stocks, establishing that autoregressive residual formulation stabilizes neural training and downstream Markowitz portfolio optimization. Hansun and Young [3] evaluated three-layer LSTM networks on emerging market banking equities from Indonesia's LQ45 index, demonstrating that compact recurrent configurations achieve robust predictive accuracy without overfitting noise.</w:t>
       </w:r>
     </w:p>
     <w:p>
@@ -2718,10 +2697,7 @@
     </w:p>
     <w:p>
       <w:r>
-        <w:t>Wang et al. [5] adapted the self-attention Transformer to four major global indices (S&amp;P 500, CSI 300, Hang Seng, Nikkei 225), demonstrating that global multi-head attention captures abrupt market regime shifts significantly faster than unidirectional recurrent networks. Kayit and Ismail [8] evaluated hybrid ensembles on S&amp;P 500 equities, demonstrating that stacking diverse linear, recurrent, and tree-based models achieved 95.8% directional accuracy, outperforming every individual learner. Li and Xu [6] int</w:t>
-      </w:r>
-      <w:r>
-        <w:t>egrated Transformer-based attention to extract temporal explainability weights, demonstrating that attention pooling reveals historical memory.</w:t>
+        <w:t>Wang et al. [5] adapted the self-attention Transformer to four major global indices (S&amp;P 500, CSI 300, Hang Seng, Nikkei 225), demonstrating that global multi-head attention captures abrupt market regime shifts significantly faster than unidirectional recurrent networks. Kayit and Ismail [8] evaluated hybrid ensembles on S&amp;P 500 equities, demonstrating that stacking diverse linear, recurrent, and tree-based models achieved 95.8% directional accuracy, outperforming every individual learner. Li and Xu [6] integrated Transformer-based attention to extract temporal explainability weights, demonstrating that attention pooling reveals historical memory.</w:t>
       </w:r>
     </w:p>
     <w:p>
@@ -4976,15 +4952,7 @@
                 <w:color w:val="0D1B40"/>
                 <w:sz w:val="20"/>
               </w:rPr>
-              <w:t>ŷ</w:t>
-            </w:r>
-            <w:r>
-              <w:rPr>
-                <w:rFonts w:ascii="Cambria Math" w:hAnsi="Cambria Math"/>
-                <w:color w:val="0D1B40"/>
-                <w:sz w:val="20"/>
-              </w:rPr>
-              <w:t>_t = y_{t-1} + Δŷ_t</w:t>
+              <w:t>ŷ_t = y_{t-1} + Δŷ_t</w:t>
             </w:r>
           </w:p>
           <w:p>
@@ -5451,15 +5419,7 @@
                 <w:color w:val="0D1B40"/>
                 <w:sz w:val="20"/>
               </w:rPr>
-              <w:t>ŷ</w:t>
-            </w:r>
-            <w:r>
-              <w:rPr>
-                <w:rFonts w:ascii="Cambria Math" w:hAnsi="Cambria Math"/>
-                <w:color w:val="0D1B40"/>
-                <w:sz w:val="20"/>
-              </w:rPr>
-              <w:t>_{ensemble} = w^T · [ ŷ_{BiLSTM},  ŷ_{Transformer},  ŷ_{GRU} ]^T + b</w:t>
+              <w:t>ŷ_{ensemble} = w^T · [ ŷ_{BiLSTM},  ŷ_{Transformer},  ŷ_{GRU} ]^T + b</w:t>
             </w:r>
           </w:p>
         </w:tc>
@@ -8892,13 +8852,6 @@
                 <w:sz w:val="16"/>
               </w:rPr>
               <w:br/>
-            </w:r>
-            <w:r>
-              <w:rPr>
-                <w:rFonts w:ascii="Consolas" w:hAnsi="Consolas"/>
-                <w:color w:val="1F2328"/>
-                <w:sz w:val="16"/>
-              </w:rPr>
               <w:t xml:space="preserve">        for p in [5, 10, 20, 50, 200]:</w:t>
             </w:r>
             <w:r>

</xml_diff>